<commit_message>
docs(inteligencia): Competidor #1 — Esri Real Estate AI Agent
Analisis del showcase de Esri (gigante del GIS): metodo (proximidad-a-hotspot
por factor sobre NYC Open Data + synthetic listings), las 3 confirmaciones
(concepto validado / el dato es el foso / no llega a Latam), tabla de
diferenciacion lista para pitch, y 2 takeaways de tecnica (narracion de
proximidad + el corredor como nuestro "311"). La respuesta cuando un
inversor pregunte "y si Esri/Google entra".

Co-Authored-By: Claude Opus 4.8 (1M context) <noreply@anthropic.com>
</commit_message>
<xml_diff>
--- a/docs/INTELIGENCIA_y_PLAN_2026-06-16.docx
+++ b/docs/INTELIGENCIA_y_PLAN_2026-06-16.docx
@@ -931,6 +931,498 @@
         <w:pStyle w:val="Heading1"/>
       </w:pPr>
       <w:r>
+        <w:t>🥊 Competidor de referencia #1 — Esri "Real Estate AI Agent"</w:t>
+      </w:r>
+    </w:p>
+    <w:p>
+      <w:r>
+        <w:t>*(Showcase de Esri —el gigante mundial del GIS/ArcGIS— publicado jun 2026 por Sajit Thomas, Application Architect. Demo, no producto lanzado. La respuesta lista cuando un inversor pregunte "¿y si Esri/Google entra?".)*</w:t>
+      </w:r>
+    </w:p>
+    <w:p>
+      <w:r>
+        <w:rPr>
+          <w:b/>
+        </w:rPr>
+        <w:t>Qué es:</w:t>
+      </w:r>
+      <w:r>
+        <w:t xml:space="preserve"> un agente (por voz) que, sobre una escena 3D cinematográfica de Manhattan, analiza el entorno de un listing por factores. Datos: </w:t>
+      </w:r>
+      <w:r>
+        <w:rPr>
+          <w:b/>
+        </w:rPr>
+        <w:t>NYC Open Data + synthetic listings + ArcGIS Location Services.</w:t>
+      </w:r>
+    </w:p>
+    <w:p>
+      <w:r>
+        <w:rPr>
+          <w:b/>
+        </w:rPr>
+        <w:t>El método (debajo del eye-candy):</w:t>
+      </w:r>
+      <w:r>
+        <w:t xml:space="preserve"> *proximidad a hotspot por factor* — hexbins + top 5º percentil + distancia en metros al pico, narrado por el agente:</w:t>
+      </w:r>
+    </w:p>
+    <w:tbl>
+      <w:tblPr>
+        <w:tblStyle w:val="LightGrid-Accent1"/>
+        <w:tblW w:type="auto" w:w="0"/>
+        <w:tblLook w:firstColumn="1" w:firstRow="1" w:lastColumn="0" w:lastRow="0" w:noHBand="0" w:noVBand="1" w:val="04A0"/>
+      </w:tblPr>
+      <w:tblGrid>
+        <w:gridCol w:w="4320"/>
+        <w:gridCol w:w="4320"/>
+      </w:tblGrid>
+      <w:tr>
+        <w:tc>
+          <w:tcPr>
+            <w:tcW w:type="dxa" w:w="4320"/>
+          </w:tcPr>
+          <w:p>
+            <w:r>
+              <w:rPr>
+                <w:b/>
+              </w:rPr>
+            </w:r>
+            <w:r>
+              <w:rPr>
+                <w:b/>
+              </w:rPr>
+              <w:t>Factor</w:t>
+            </w:r>
+          </w:p>
+        </w:tc>
+        <w:tc>
+          <w:tcPr>
+            <w:tcW w:type="dxa" w:w="4320"/>
+          </w:tcPr>
+          <w:p>
+            <w:r>
+              <w:rPr>
+                <w:b/>
+              </w:rPr>
+            </w:r>
+            <w:r>
+              <w:rPr>
+                <w:b/>
+              </w:rPr>
+              <w:t>Narración del agente</w:t>
+            </w:r>
+          </w:p>
+        </w:tc>
+      </w:tr>
+      <w:tr>
+        <w:tc>
+          <w:tcPr>
+            <w:tcW w:type="dxa" w:w="4320"/>
+          </w:tcPr>
+          <w:p>
+            <w:r/>
+            <w:r>
+              <w:t>Crimen</w:t>
+            </w:r>
+          </w:p>
+        </w:tc>
+        <w:tc>
+          <w:tcPr>
+            <w:tcW w:type="dxa" w:w="4320"/>
+          </w:tcPr>
+          <w:p>
+            <w:r/>
+            <w:r>
+              <w:t>"296 incidentes; mayor concentración (113) a 52m del listing"</w:t>
+            </w:r>
+          </w:p>
+        </w:tc>
+      </w:tr>
+      <w:tr>
+        <w:tc>
+          <w:tcPr>
+            <w:tcW w:type="dxa" w:w="4320"/>
+          </w:tcPr>
+          <w:p>
+            <w:r/>
+            <w:r>
+              <w:t>311 service requests (proxy de molestia/ruido)</w:t>
+            </w:r>
+          </w:p>
+        </w:tc>
+        <w:tc>
+          <w:tcPr>
+            <w:tcW w:type="dxa" w:w="4320"/>
+          </w:tcPr>
+          <w:p>
+            <w:r/>
+            <w:r>
+              <w:t>"1000 solicitudes en 500m: vendedores, parqueo ilegal, ruido-comercial; pico a 69m"</w:t>
+            </w:r>
+          </w:p>
+        </w:tc>
+      </w:tr>
+      <w:tr>
+        <w:tc>
+          <w:tcPr>
+            <w:tcW w:type="dxa" w:w="4320"/>
+          </w:tcPr>
+          <w:p>
+            <w:r/>
+            <w:r>
+              <w:t>Dining</w:t>
+            </w:r>
+          </w:p>
+        </w:tc>
+        <w:tc>
+          <w:tcPr>
+            <w:tcW w:type="dxa" w:w="4320"/>
+          </w:tcPr>
+          <w:p>
+            <w:r/>
+            <w:r>
+              <w:t>"20 lugares en 500m: lounges, postres, bubble tea; concentración a 135m"</w:t>
+            </w:r>
+          </w:p>
+        </w:tc>
+      </w:tr>
+    </w:tbl>
+    <w:p>
+      <w:r>
+        <w:rPr>
+          <w:b/>
+        </w:rPr>
+        <w:t>Las 3 confirmaciones (todas a nuestro favor):</w:t>
+      </w:r>
+    </w:p>
+    <w:p>
+      <w:pPr>
+        <w:pStyle w:val="ListNumber"/>
+      </w:pPr>
+      <w:r>
+        <w:rPr>
+          <w:b/>
+        </w:rPr>
+        <w:t>El concepto es el futuro</w:t>
+      </w:r>
+      <w:r>
+        <w:t xml:space="preserve"> — el líder del GIS valida nuestra tesis (igual que Nadella validó el "sistema vivo").</w:t>
+      </w:r>
+    </w:p>
+    <w:p>
+      <w:pPr>
+        <w:pStyle w:val="ListNumber"/>
+      </w:pPr>
+      <w:r>
+        <w:rPr>
+          <w:b/>
+        </w:rPr>
+        <w:t>El DATO es el foso</w:t>
+      </w:r>
+      <w:r>
+        <w:t xml:space="preserve"> — su demo solo funciona en NYC por el open data + listings falsos. *Pídeselo para Quito y se desarma* (no hay crime data, no hay 311, no hay listings reales).</w:t>
+      </w:r>
+    </w:p>
+    <w:p>
+      <w:pPr>
+        <w:pStyle w:val="ListNumber"/>
+      </w:pPr>
+      <w:r>
+        <w:rPr>
+          <w:b/>
+        </w:rPr>
+        <w:t>Su enfoque NO llega a Latam</w:t>
+      </w:r>
+      <w:r>
+        <w:t xml:space="preserve"> — depende justo de lo que la región no tiene. Nuestro </w:t>
+      </w:r>
+      <w:r>
+        <w:rPr>
+          <w:b/>
+        </w:rPr>
+        <w:t>corredor-loop resuelve el dato</w:t>
+      </w:r>
+      <w:r>
+        <w:t xml:space="preserve"> donde ellos no pueden.</w:t>
+      </w:r>
+    </w:p>
+    <w:p>
+      <w:r>
+        <w:rPr>
+          <w:b/>
+        </w:rPr>
+        <w:t>Diferenciación (tabla de pitch):</w:t>
+      </w:r>
+    </w:p>
+    <w:tbl>
+      <w:tblPr>
+        <w:tblStyle w:val="LightGrid-Accent1"/>
+        <w:tblW w:type="auto" w:w="0"/>
+        <w:tblLook w:firstColumn="1" w:firstRow="1" w:lastColumn="0" w:lastRow="0" w:noHBand="0" w:noVBand="1" w:val="04A0"/>
+      </w:tblPr>
+      <w:tblGrid>
+        <w:gridCol w:w="4320"/>
+        <w:gridCol w:w="4320"/>
+      </w:tblGrid>
+      <w:tr>
+        <w:tc>
+          <w:tcPr>
+            <w:tcW w:type="dxa" w:w="4320"/>
+          </w:tcPr>
+          <w:p>
+            <w:r>
+              <w:rPr>
+                <w:b/>
+              </w:rPr>
+            </w:r>
+            <w:r>
+              <w:rPr>
+                <w:b/>
+              </w:rPr>
+              <w:t>Esri agent</w:t>
+            </w:r>
+          </w:p>
+        </w:tc>
+        <w:tc>
+          <w:tcPr>
+            <w:tcW w:type="dxa" w:w="4320"/>
+          </w:tcPr>
+          <w:p>
+            <w:r>
+              <w:rPr>
+                <w:b/>
+              </w:rPr>
+            </w:r>
+            <w:r>
+              <w:rPr>
+                <w:b/>
+              </w:rPr>
+              <w:t>Contexto</w:t>
+            </w:r>
+          </w:p>
+        </w:tc>
+      </w:tr>
+      <w:tr>
+        <w:tc>
+          <w:tcPr>
+            <w:tcW w:type="dxa" w:w="4320"/>
+          </w:tcPr>
+          <w:p>
+            <w:r/>
+            <w:r>
+              <w:t>Data pública (NYC Open Data)</w:t>
+            </w:r>
+          </w:p>
+        </w:tc>
+        <w:tc>
+          <w:tcPr>
+            <w:tcW w:type="dxa" w:w="4320"/>
+          </w:tcPr>
+          <w:p>
+            <w:r/>
+            <w:r>
+              <w:t xml:space="preserve">Dato local + </w:t>
+            </w:r>
+            <w:r>
+              <w:rPr>
+                <w:b/>
+              </w:rPr>
+              <w:t>contribuido por el corredor</w:t>
+            </w:r>
+            <w:r>
+              <w:t xml:space="preserve"> donde no hay data pública</w:t>
+            </w:r>
+          </w:p>
+        </w:tc>
+      </w:tr>
+      <w:tr>
+        <w:tc>
+          <w:tcPr>
+            <w:tcW w:type="dxa" w:w="4320"/>
+          </w:tcPr>
+          <w:p>
+            <w:r/>
+            <w:r>
+              <w:rPr>
+                <w:b/>
+              </w:rPr>
+              <w:t>Synthetic listings</w:t>
+            </w:r>
+            <w:r>
+              <w:t xml:space="preserve"> (inventario falso)</w:t>
+            </w:r>
+          </w:p>
+        </w:tc>
+        <w:tc>
+          <w:tcPr>
+            <w:tcW w:type="dxa" w:w="4320"/>
+          </w:tcPr>
+          <w:p>
+            <w:r/>
+            <w:r>
+              <w:rPr>
+                <w:b/>
+              </w:rPr>
+              <w:t>Listings reales</w:t>
+            </w:r>
+          </w:p>
+        </w:tc>
+      </w:tr>
+      <w:tr>
+        <w:tc>
+          <w:tcPr>
+            <w:tcW w:type="dxa" w:w="4320"/>
+          </w:tcPr>
+          <w:p>
+            <w:r/>
+            <w:r>
+              <w:t>Datasets con lag</w:t>
+            </w:r>
+          </w:p>
+        </w:tc>
+        <w:tc>
+          <w:tcPr>
+            <w:tcW w:type="dxa" w:w="4320"/>
+          </w:tcPr>
+          <w:p>
+            <w:r/>
+            <w:r>
+              <w:rPr>
+                <w:b/>
+              </w:rPr>
+              <w:t>Dato fresco verificado</w:t>
+            </w:r>
+            <w:r>
+              <w:t xml:space="preserve"> (PROMART de hace 1 mes, ya capturado)</w:t>
+            </w:r>
+          </w:p>
+        </w:tc>
+      </w:tr>
+      <w:tr>
+        <w:tc>
+          <w:tcPr>
+            <w:tcW w:type="dxa" w:w="4320"/>
+          </w:tcPr>
+          <w:p>
+            <w:r/>
+            <w:r>
+              <w:t>Plataforma B2B/enterprise (ArcGIS)</w:t>
+            </w:r>
+          </w:p>
+        </w:tc>
+        <w:tc>
+          <w:tcPr>
+            <w:tcW w:type="dxa" w:w="4320"/>
+          </w:tcPr>
+          <w:p>
+            <w:r/>
+            <w:r>
+              <w:rPr>
+                <w:b/>
+              </w:rPr>
+              <w:t>App de consumo + handoff humano</w:t>
+            </w:r>
+          </w:p>
+        </w:tc>
+      </w:tr>
+      <w:tr>
+        <w:tc>
+          <w:tcPr>
+            <w:tcW w:type="dxa" w:w="4320"/>
+          </w:tcPr>
+          <w:p>
+            <w:r/>
+            <w:r>
+              <w:t>Eye-candy 3D</w:t>
+            </w:r>
+          </w:p>
+        </w:tc>
+        <w:tc>
+          <w:tcPr>
+            <w:tcW w:type="dxa" w:w="4320"/>
+          </w:tcPr>
+          <w:p>
+            <w:r/>
+            <w:r>
+              <w:t>Honestidad + confianza + conversación</w:t>
+            </w:r>
+          </w:p>
+        </w:tc>
+      </w:tr>
+    </w:tbl>
+    <w:p>
+      <w:r>
+        <w:rPr>
+          <w:b/>
+        </w:rPr>
+        <w:t>2 takeaways para robar (técnica, no estrategia):</w:t>
+      </w:r>
+    </w:p>
+    <w:p>
+      <w:pPr>
+        <w:pStyle w:val="ListBullet"/>
+      </w:pPr>
+      <w:r>
+        <w:t xml:space="preserve">La </w:t>
+      </w:r>
+      <w:r>
+        <w:rPr>
+          <w:b/>
+        </w:rPr>
+        <w:t>narración "proximidad a concentración + distancia"</w:t>
+      </w:r>
+      <w:r>
+        <w:t xml:space="preserve"> ("la mayor concentración de X está a Ym del inmueble") — adoptar cuando el grafo contribuido sea denso.</w:t>
+      </w:r>
+    </w:p>
+    <w:p>
+      <w:pPr>
+        <w:pStyle w:val="ListBullet"/>
+      </w:pPr>
+      <w:r>
+        <w:t xml:space="preserve">El </w:t>
+      </w:r>
+      <w:r>
+        <w:rPr>
+          <w:b/>
+        </w:rPr>
+        <w:t>corredor es nuestro "311"</w:t>
+      </w:r>
+      <w:r>
+        <w:t>: el proxy humano de molestia/ruido donde no hay datos públicos de quejas.</w:t>
+      </w:r>
+    </w:p>
+    <w:p>
+      <w:r>
+        <w:rPr>
+          <w:b/>
+        </w:rPr>
+        <w:t>Qué NO hacer (P5):</w:t>
+      </w:r>
+      <w:r>
+        <w:t xml:space="preserve"> no competir en GIS multi-factor ni en render 3D — su cancha, pierdes. Nuestro foso es el dato local-contribuido, ortogonal a su fortaleza.</w:t>
+      </w:r>
+    </w:p>
+    <w:p>
+      <w:pPr>
+        <w:pStyle w:val="IntenseQuote"/>
+      </w:pPr>
+      <w:r>
+        <w:rPr>
+          <w:b/>
+        </w:rPr>
+        <w:t>Frase de pitch:</w:t>
+      </w:r>
+      <w:r>
+        <w:t xml:space="preserve"> *"Esri tiene el mapa; nosotros tenemos el territorio. Ellos, un demo bello con listings sintéticos sobre data pública de EE.UU.; nosotros, un producto real con dato fresco del corredor, donde la data pública no existe."*</w:t>
+      </w:r>
+    </w:p>
+    <w:p>
+      <w:pPr>
+        <w:pStyle w:val="Heading1"/>
+      </w:pPr>
+      <w:r>
         <w:t>PARTE 2 — Plan de Acción</w:t>
       </w:r>
     </w:p>
@@ -1850,6 +2342,30 @@
       </w:r>
     </w:p>
     <w:p>
+      <w:pPr>
+        <w:pStyle w:val="ListBullet"/>
+      </w:pPr>
+      <w:r>
+        <w:t>ArcGIS for Real Estate (B2B) — Esri: https://www.esri.com/en-us/industries/real-estate/overview</w:t>
+      </w:r>
+    </w:p>
+    <w:p>
+      <w:pPr>
+        <w:pStyle w:val="ListBullet"/>
+      </w:pPr>
+      <w:r>
+        <w:t>Geospatial AI en ArcGIS — Esri: https://www.esri.com/en-us/geospatial-artificial-intelligence/overview</w:t>
+      </w:r>
+    </w:p>
+    <w:p>
+      <w:pPr>
+        <w:pStyle w:val="ListBullet"/>
+      </w:pPr>
+      <w:r>
+        <w:t>Sajit Thomas, Application Architect @ Esri — LinkedIn: https://www.linkedin.com/in/sajit-thomas-33a9a034/</w:t>
+      </w:r>
+    </w:p>
+    <w:p>
       <w:r>
         <w:t>*Generado el 16 jun 2026. Próxima revisión sugerida: fin de la semana 2 (29 jun), para medir avance del loop de contribución.*</w:t>
       </w:r>

</xml_diff>

<commit_message>
docs(inteligencia): Competidor #2 — Realtor.com RealAssist AI
Portal real US (MLS) con busqueda AI-first conversacional sobre Gemini —
el competidor-concepto mas cercano (toca commute/amenities/neighborhood-fit).
Diferenciacion: US/MLS + data commodity de Google, ausente en Latam, sin capa
contribuida; nuestro foso (dato local verificado + contribuido + honestidad)
es ortogonal. Angulo clave: mercado ESCEPTICO de IA (PYMNTS) -> la honestidad
gana. Tres validaciones en una semana (Nadella, Esri, Realtor.com).

Co-Authored-By: Claude Opus 4.8 (1M context) <noreply@anthropic.com>
</commit_message>
<xml_diff>
--- a/docs/INTELIGENCIA_y_PLAN_2026-06-16.docx
+++ b/docs/INTELIGENCIA_y_PLAN_2026-06-16.docx
@@ -1423,6 +1423,394 @@
         <w:pStyle w:val="Heading1"/>
       </w:pPr>
       <w:r>
+        <w:t>🥊 Competidor de referencia #2 — Realtor.com "RealAssist™ AI"</w:t>
+      </w:r>
+    </w:p>
+    <w:p>
+      <w:r>
+        <w:t>*(Portal inmobiliario real de EE.UU. —News Corp/Move Inc.—, NO un demo. Beta desde el 2 jun 2026, sobre Google Gemini + Cloud. El competidor-concepto MÁS cercano hasta ahora.)*</w:t>
+      </w:r>
+    </w:p>
+    <w:p>
+      <w:r>
+        <w:rPr>
+          <w:b/>
+        </w:rPr>
+        <w:t>Qué es:</w:t>
+      </w:r>
+      <w:r>
+        <w:t xml:space="preserve"> búsqueda de vivienda </w:t>
+      </w:r>
+      <w:r>
+        <w:rPr>
+          <w:b/>
+        </w:rPr>
+        <w:t>AI-first conversacional</w:t>
+      </w:r>
+      <w:r>
+        <w:t xml:space="preserve"> sobre su inventario MLS. Integra listings MLS, affordability, conexión con agentes, prompts iterativos — y </w:t>
+      </w:r>
+      <w:r>
+        <w:rPr>
+          <w:b/>
+        </w:rPr>
+        <w:t>commute-time, amenities cercanas y "cómo encaja un barrio en tu rutina"</w:t>
+      </w:r>
+      <w:r>
+        <w:t xml:space="preserve"> (sí toca nuestra capa de "cómo es vivir aquí"). Enmarca la IA como *"hacer al agente humano MÁS valioso, no menos"* — nuestra tesis exacta.</w:t>
+      </w:r>
+    </w:p>
+    <w:p>
+      <w:r>
+        <w:rPr>
+          <w:b/>
+        </w:rPr>
+        <w:t>Diferenciación (tabla de pitch):</w:t>
+      </w:r>
+    </w:p>
+    <w:tbl>
+      <w:tblPr>
+        <w:tblStyle w:val="LightGrid-Accent1"/>
+        <w:tblW w:type="auto" w:w="0"/>
+        <w:tblLook w:firstColumn="1" w:firstRow="1" w:lastColumn="0" w:lastRow="0" w:noHBand="0" w:noVBand="1" w:val="04A0"/>
+      </w:tblPr>
+      <w:tblGrid>
+        <w:gridCol w:w="4320"/>
+        <w:gridCol w:w="4320"/>
+      </w:tblGrid>
+      <w:tr>
+        <w:tc>
+          <w:tcPr>
+            <w:tcW w:type="dxa" w:w="4320"/>
+          </w:tcPr>
+          <w:p>
+            <w:r>
+              <w:rPr>
+                <w:b/>
+              </w:rPr>
+            </w:r>
+            <w:r>
+              <w:rPr>
+                <w:b/>
+              </w:rPr>
+              <w:t>RealAssist</w:t>
+            </w:r>
+          </w:p>
+        </w:tc>
+        <w:tc>
+          <w:tcPr>
+            <w:tcW w:type="dxa" w:w="4320"/>
+          </w:tcPr>
+          <w:p>
+            <w:r>
+              <w:rPr>
+                <w:b/>
+              </w:rPr>
+            </w:r>
+            <w:r>
+              <w:rPr>
+                <w:b/>
+              </w:rPr>
+              <w:t>Contexto</w:t>
+            </w:r>
+          </w:p>
+        </w:tc>
+      </w:tr>
+      <w:tr>
+        <w:tc>
+          <w:tcPr>
+            <w:tcW w:type="dxa" w:w="4320"/>
+          </w:tcPr>
+          <w:p>
+            <w:r/>
+            <w:r>
+              <w:rPr>
+                <w:b/>
+              </w:rPr>
+              <w:t>US / MLS</w:t>
+            </w:r>
+            <w:r>
+              <w:t xml:space="preserve"> (no hay MLS en Ecuador; no operan en Latam)</w:t>
+            </w:r>
+          </w:p>
+        </w:tc>
+        <w:tc>
+          <w:tcPr>
+            <w:tcW w:type="dxa" w:w="4320"/>
+          </w:tcPr>
+          <w:p>
+            <w:r/>
+            <w:r>
+              <w:rPr>
+                <w:b/>
+              </w:rPr>
+              <w:t>Quito/Latam</w:t>
+            </w:r>
+            <w:r>
+              <w:t xml:space="preserve"> — donde están ausentes</w:t>
+            </w:r>
+          </w:p>
+        </w:tc>
+      </w:tr>
+      <w:tr>
+        <w:tc>
+          <w:tcPr>
+            <w:tcW w:type="dxa" w:w="4320"/>
+          </w:tcPr>
+          <w:p>
+            <w:r/>
+            <w:r>
+              <w:t xml:space="preserve">"Neighborhood fit" desde </w:t>
+            </w:r>
+            <w:r>
+              <w:rPr>
+                <w:b/>
+              </w:rPr>
+              <w:t>data commodity de Google</w:t>
+            </w:r>
+          </w:p>
+        </w:tc>
+        <w:tc>
+          <w:tcPr>
+            <w:tcW w:type="dxa" w:w="4320"/>
+          </w:tcPr>
+          <w:p>
+            <w:r/>
+            <w:r>
+              <w:t xml:space="preserve">Entorno </w:t>
+            </w:r>
+            <w:r>
+              <w:rPr>
+                <w:b/>
+              </w:rPr>
+              <w:t>verificado + contribuido por el corredor, más fresco</w:t>
+            </w:r>
+            <w:r>
+              <w:t xml:space="preserve"> que Google</w:t>
+            </w:r>
+          </w:p>
+        </w:tc>
+      </w:tr>
+      <w:tr>
+        <w:tc>
+          <w:tcPr>
+            <w:tcW w:type="dxa" w:w="4320"/>
+          </w:tcPr>
+          <w:p>
+            <w:r/>
+            <w:r>
+              <w:t>Sin ficha técnica verificada</w:t>
+            </w:r>
+          </w:p>
+        </w:tc>
+        <w:tc>
+          <w:tcPr>
+            <w:tcW w:type="dxa" w:w="4320"/>
+          </w:tcPr>
+          <w:p>
+            <w:r/>
+            <w:r>
+              <w:t>Catastro vivo verificado</w:t>
+            </w:r>
+          </w:p>
+        </w:tc>
+      </w:tr>
+      <w:tr>
+        <w:tc>
+          <w:tcPr>
+            <w:tcW w:type="dxa" w:w="4320"/>
+          </w:tcPr>
+          <w:p>
+            <w:r/>
+            <w:r>
+              <w:rPr>
+                <w:b/>
+              </w:rPr>
+              <w:t>Portal</w:t>
+            </w:r>
+            <w:r>
+              <w:t xml:space="preserve"> (inventario MLS + referidos)</w:t>
+            </w:r>
+          </w:p>
+        </w:tc>
+        <w:tc>
+          <w:tcPr>
+            <w:tcW w:type="dxa" w:w="4320"/>
+          </w:tcPr>
+          <w:p>
+            <w:r/>
+            <w:r>
+              <w:rPr>
+                <w:b/>
+              </w:rPr>
+              <w:t>Catastro vivo</w:t>
+            </w:r>
+            <w:r>
+              <w:t xml:space="preserve"> — el dato pertenece a la coordenada, no al anuncio</w:t>
+            </w:r>
+          </w:p>
+        </w:tc>
+      </w:tr>
+    </w:tbl>
+    <w:p>
+      <w:r>
+        <w:rPr>
+          <w:b/>
+        </w:rPr>
+        <w:t>El punto clave:</w:t>
+      </w:r>
+      <w:r>
+        <w:t xml:space="preserve"> incluso su capa de barrio usa </w:t>
+      </w:r>
+      <w:r>
+        <w:rPr>
+          <w:b/>
+        </w:rPr>
+        <w:t>data commodity de Google</w:t>
+      </w:r>
+      <w:r>
+        <w:t xml:space="preserve"> — la misma que cualquiera tiene. </w:t>
+      </w:r>
+      <w:r>
+        <w:rPr>
+          <w:b/>
+        </w:rPr>
+        <w:t>Nuestro dato del corredor le gana en nuestro mercado</w:t>
+      </w:r>
+      <w:r>
+        <w:t xml:space="preserve"> (local, verificado, fresco). Ellos = portal más inteligente; nosotros = modelo distinto.</w:t>
+      </w:r>
+    </w:p>
+    <w:p>
+      <w:r>
+        <w:rPr>
+          <w:b/>
+        </w:rPr>
+        <w:t>El regalo escondido (PYMNTS, *"The AI House Hunter Meets a Skeptical Market"*):</w:t>
+      </w:r>
+      <w:r>
+        <w:t xml:space="preserve"> el mercado está </w:t>
+      </w:r>
+      <w:r>
+        <w:rPr>
+          <w:b/>
+        </w:rPr>
+        <w:t>escéptico</w:t>
+      </w:r>
+      <w:r>
+        <w:t xml:space="preserve"> de los buscadores con IA. Nuestra marca entera es </w:t>
+      </w:r>
+      <w:r>
+        <w:rPr>
+          <w:b/>
+        </w:rPr>
+        <w:t>honestidad ("la IA en la que confías")</w:t>
+      </w:r>
+      <w:r>
+        <w:t xml:space="preserve">. En un mercado escéptico, </w:t>
+      </w:r>
+      <w:r>
+        <w:rPr>
+          <w:b/>
+        </w:rPr>
+        <w:t>la IA que NO miente gana</w:t>
+      </w:r>
+      <w:r>
+        <w:t xml:space="preserve"> → el recelo del consumidor valida nuestro posicionamiento.</w:t>
+      </w:r>
+    </w:p>
+    <w:p>
+      <w:r>
+        <w:rPr>
+          <w:b/>
+        </w:rPr>
+        <w:t>Takeaway estratégico:</w:t>
+      </w:r>
+      <w:r>
+        <w:t xml:space="preserve"> la ventana para "búsqueda genérica con IA" </w:t>
+      </w:r>
+      <w:r>
+        <w:rPr>
+          <w:b/>
+        </w:rPr>
+        <w:t>se cierra en EE.UU.</w:t>
+      </w:r>
+      <w:r>
+        <w:t xml:space="preserve"> (los incumbentes la tomarán). Espacio defendible = </w:t>
+      </w:r>
+      <w:r>
+        <w:rPr>
+          <w:b/>
+        </w:rPr>
+        <w:t>Latam + capa de dato verificado/contribuido</w:t>
+      </w:r>
+      <w:r>
+        <w:t xml:space="preserve"> (que ni ellos, con Google, tienen). NO derivar a "portal con IA mejor" (ahí ganan por inventario); quedarse en </w:t>
+      </w:r>
+      <w:r>
+        <w:rPr>
+          <w:b/>
+        </w:rPr>
+        <w:t>"la verdad del lugar, en Latam."</w:t>
+      </w:r>
+    </w:p>
+    <w:p>
+      <w:pPr>
+        <w:pStyle w:val="IntenseQuote"/>
+      </w:pPr>
+      <w:r>
+        <w:rPr>
+          <w:b/>
+        </w:rPr>
+        <w:t>Frase de pitch:</w:t>
+      </w:r>
+      <w:r>
+        <w:t xml:space="preserve"> *"Realtor.com hace más inteligente buscar anuncios en EE.UU. con data de Google. Nosotros decimos la verdad de dónde vivirías en Quito, con dato del corredor que Google no tiene — y en un mercado que ya no confía en la IA, somos la que no miente."*</w:t>
+      </w:r>
+    </w:p>
+    <w:p>
+      <w:r>
+        <w:rPr>
+          <w:b/>
+        </w:rPr>
+        <w:t>Síntesis de los dos competidores:</w:t>
+      </w:r>
+      <w:r>
+        <w:t xml:space="preserve"> Esri (demo, data pública) + Realtor.com (portal real, MLS) + Nadella → </w:t>
+      </w:r>
+      <w:r>
+        <w:rPr>
+          <w:b/>
+        </w:rPr>
+        <w:t>tres validaciones en una semana.</w:t>
+      </w:r>
+      <w:r>
+        <w:t xml:space="preserve"> Ambos son </w:t>
+      </w:r>
+      <w:r>
+        <w:rPr>
+          <w:b/>
+        </w:rPr>
+        <w:t>US, sin capa contribuida, ausentes en Latam.</w:t>
+      </w:r>
+      <w:r>
+        <w:t xml:space="preserve"> Nuestro foso —dato local verificado + contribuido + honestidad— es </w:t>
+      </w:r>
+      <w:r>
+        <w:rPr>
+          <w:b/>
+        </w:rPr>
+        <w:t>estructuralmente ortogonal</w:t>
+      </w:r>
+      <w:r>
+        <w:t xml:space="preserve"> a ambos.</w:t>
+      </w:r>
+    </w:p>
+    <w:p>
+      <w:pPr>
+        <w:pStyle w:val="Heading1"/>
+      </w:pPr>
+      <w:r>
         <w:t>PARTE 2 — Plan de Acción</w:t>
       </w:r>
     </w:p>
@@ -2366,6 +2754,30 @@
       </w:r>
     </w:p>
     <w:p>
+      <w:pPr>
+        <w:pStyle w:val="ListBullet"/>
+      </w:pPr>
+      <w:r>
+        <w:t>Realtor.com lanza RealAssist AI — Google Cloud Press: https://www.googlecloudpresscorner.com/2026-06-02-Realtor-com-R-Launches-RealAssist-TM-AI-A-Completely-Reimagined-Way-to-Find-A-Home</w:t>
+      </w:r>
+    </w:p>
+    <w:p>
+      <w:pPr>
+        <w:pStyle w:val="ListBullet"/>
+      </w:pPr>
+      <w:r>
+        <w:t>RealAssist conversational search — RISMedia: https://www.rismedia.com/2026/06/08/realtor-com-launches-realassist-conversational-home-search-experience/</w:t>
+      </w:r>
+    </w:p>
+    <w:p>
+      <w:pPr>
+        <w:pStyle w:val="ListBullet"/>
+      </w:pPr>
+      <w:r>
+        <w:t>"The AI House Hunter Meets a Skeptical Market" — PYMNTS: https://www.pymnts.com/artificial-intelligence-2/2026/the-ai-house-hunter-meets-a-skeptical-market/</w:t>
+      </w:r>
+    </w:p>
+    <w:p>
       <w:r>
         <w:t>*Generado el 16 jun 2026. Próxima revisión sugerida: fin de la semana 2 (29 jun), para medir avance del loop de contribución.*</w:t>
       </w:r>

</xml_diff>